<commit_message>
Se actualiza el cargo de yuly, en las cartas de evaluacion y seleccion
</commit_message>
<xml_diff>
--- a/public/Carta Evaluacion.docx
+++ b/public/Carta Evaluacion.docx
@@ -521,7 +521,13 @@
         <w:rPr>
           <w:rFonts w:asciiTheme="majorHAnsi" w:hAnsiTheme="majorHAnsi" w:cstheme="majorHAnsi"/>
         </w:rPr>
-        <w:t>Analista administrativo y financiero</w:t>
+        <w:t>Profesional</w:t>
+      </w:r>
+      <w:r>
+        <w:rPr>
+          <w:rFonts w:asciiTheme="majorHAnsi" w:hAnsiTheme="majorHAnsi" w:cstheme="majorHAnsi"/>
+        </w:rPr>
+        <w:t xml:space="preserve"> administrativo y financiero</w:t>
       </w:r>
     </w:p>
     <w:p>
@@ -640,19 +646,8 @@
         <w:sz w:val="20"/>
         <w:szCs w:val="20"/>
       </w:rPr>
-      <w:t xml:space="preserve">Carrera 15 </w:t>
+      <w:t>Carrera 15 Nº</w:t>
     </w:r>
-    <w:proofErr w:type="spellStart"/>
-    <w:r>
-      <w:rPr>
-        <w:rFonts w:cstheme="majorHAnsi"/>
-        <w:color w:val="162B47"/>
-        <w:sz w:val="20"/>
-        <w:szCs w:val="20"/>
-      </w:rPr>
-      <w:t>Nº</w:t>
-    </w:r>
-    <w:proofErr w:type="spellEnd"/>
     <w:r>
       <w:rPr>
         <w:rFonts w:cstheme="majorHAnsi"/>
@@ -2031,7 +2026,7 @@
       <w:szCs w:val="18"/>
     </w:rPr>
   </w:style>
-  <w:style w:type="character" w:styleId="Textoennegrita">
+  <w:style w:type="character" w:styleId="Fuerte">
     <w:name w:val="Strong"/>
     <w:basedOn w:val="Fuentedeprrafopredeter"/>
     <w:uiPriority w:val="22"/>

</xml_diff>